<commit_message>
docs: RSS·DB 한계 정직한 회고 + Vercel Platform 활용 명시
PRD §11 신규:
- 운영 데이터 분석 — 영상 mp4 안 쌓임, 자막+요약만 (편당 20~55KB)
- 비용 현실 — Supabase Free 8~10년 운영 가능, OpenAI 만 월 $2.5
- RSS 15편 한계 재정의 — 정상 운영에선 한계 아님, 신규 등록 백필만 진짜 제약

요약문 §5:
- Vercel Platform 행 추가 (Cron+Functions+Env+Auto-Deploy)

요약문 §8:
- 운영비 분석 단락 추가
- RSS 한계 표현 정직하게 수정

산출물 재생성:
- .docx (39,970 bytes)
- Context ZIP (20,957 bytes, PRD §11 포함)
</commit_message>
<xml_diff>
--- a/이용주-기말과제-프로젝트요약문.docx
+++ b/이용주-기말과제-프로젝트요약문.docx
@@ -1308,7 +1308,7 @@
                 <w:color w:val="1F3864"/>
                 <w:sz w:val="20"/>
               </w:rPr>
-              <w:t>API</w:t>
+              <w:t>API / Platform</w:t>
             </w:r>
           </w:p>
         </w:tc>
@@ -1581,6 +1581,65 @@
                 <w:sz w:val="18"/>
               </w:rPr>
               <w:t>6 패턴 fallback (canonical / og:url / Schema.org / JSON channelId)</w:t>
+            </w:r>
+          </w:p>
+        </w:tc>
+      </w:tr>
+      <w:tr>
+        <w:tc>
+          <w:tcPr>
+            <w:tcW w:type="dxa" w:w="2268"/>
+          </w:tcPr>
+          <w:p>
+            <w:pPr>
+              <w:spacing w:after="0"/>
+            </w:pPr>
+            <w:r/>
+            <w:r>
+              <w:rPr>
+                <w:rFonts w:ascii="맑은 고딕" w:hAnsi="맑은 고딕" w:eastAsia="맑은 고딕"/>
+                <w:b w:val="0"/>
+                <w:sz w:val="18"/>
+              </w:rPr>
+              <w:t>Vercel Platform (인프라)</w:t>
+            </w:r>
+          </w:p>
+        </w:tc>
+        <w:tc>
+          <w:tcPr>
+            <w:tcW w:type="dxa" w:w="2268"/>
+          </w:tcPr>
+          <w:p>
+            <w:pPr>
+              <w:spacing w:after="0"/>
+            </w:pPr>
+            <w:r/>
+            <w:r>
+              <w:rPr>
+                <w:rFonts w:ascii="맑은 고딕" w:hAnsi="맑은 고딕" w:eastAsia="맑은 고딕"/>
+                <w:b w:val="0"/>
+                <w:sz w:val="18"/>
+              </w:rPr>
+              <w:t>Cron 자동화 + Serverless Functions + 환경변수 + GitHub 자동 빌드</w:t>
+            </w:r>
+          </w:p>
+        </w:tc>
+        <w:tc>
+          <w:tcPr>
+            <w:tcW w:type="dxa" w:w="5102"/>
+          </w:tcPr>
+          <w:p>
+            <w:pPr>
+              <w:spacing w:after="0"/>
+            </w:pPr>
+            <w:r/>
+            <w:r>
+              <w:rPr>
+                <w:rFonts w:ascii="맑은 고딕" w:hAnsi="맑은 고딕" w:eastAsia="맑은 고딕"/>
+                <w:b w:val="0"/>
+                <w:sz w:val="18"/>
+              </w:rPr>
+              <w:t>vercel.json 의 crons → 매일 0시 UTC /api/cron 자동 트리거. push 시 자동 재배포 (GitHub webhook)</w:t>
             </w:r>
           </w:p>
         </w:tc>
@@ -2054,6 +2113,27 @@
         <w:t>8. 한계와 개선</w:t>
       </w:r>
     </w:p>
+    <w:p>
+      <w:pPr>
+        <w:spacing w:after="80"/>
+      </w:pPr>
+      <w:r>
+        <w:rPr>
+          <w:rFonts w:ascii="맑은 고딕" w:hAnsi="맑은 고딕" w:eastAsia="맑은 고딕"/>
+          <w:b/>
+          <w:sz w:val="20"/>
+        </w:rPr>
+        <w:t xml:space="preserve">운영 비용 / 데이터: </w:t>
+      </w:r>
+      <w:r>
+        <w:rPr>
+          <w:rFonts w:ascii="맑은 고딕" w:hAnsi="맑은 고딕" w:eastAsia="맑은 고딕"/>
+          <w:b w:val="0"/>
+          <w:sz w:val="20"/>
+        </w:rPr>
+        <w:t>영상 mp4 는 저장 안 함 (YouTube 호스팅). DB 에는 영상 1편당 ~20~55KB (메타 + 자막 + 요약). Supabase Free 500MB 안에서 약 1만 편 보관 가능 → 월 100편 처리 시 8~10년 무료 운영. 실제 월 운영비 ≈ $2.5 (OpenAI 만), Supabase/Vercel/GitHub 모두 무료 tier.</w:t>
+      </w:r>
+    </w:p>
     <w:tbl>
       <w:tblPr>
         <w:tblW w:type="auto" w:w="0"/>
@@ -2126,7 +2206,7 @@
                 <w:b w:val="0"/>
                 <w:sz w:val="18"/>
               </w:rPr>
-              <w:t>RSS 최근 15개 제약 (이전 영상 못 잡음)</w:t>
+              <w:t>신규 등록 채널의 RSS 15편 이전 영상 백필 불가 (단, 일일 cron 운영 중에는 신규 영상 누락 없음 → 정상 운영에선 한계 아님)</w:t>
             </w:r>
           </w:p>
         </w:tc>
@@ -2145,7 +2225,7 @@
                 <w:b w:val="0"/>
                 <w:sz w:val="18"/>
               </w:rPr>
-              <w:t>YouTube Data API 도입 (쿼터·인증 부담)</w:t>
+              <w:t>YouTube Data API 도입 시 등록 직후 백필 가능 (쿼터·인증 부담)</w:t>
             </w:r>
           </w:p>
         </w:tc>

</xml_diff>